<commit_message>
Record verified Render release and reuse backend for Netlify deployment
</commit_message>
<xml_diff>
--- a/artifacts/deliverables/BizPlus AI Requirements.docx
+++ b/artifacts/deliverables/BizPlus AI Requirements.docx
@@ -1575,8 +1575,23 @@
     </w:p>
     <w:p>
       <w:r>
-        <w:t>Local API and browser journey verified. Public deployment and cold-start checks remain pending.</w:t>
+        <w:t>Local browser journey verified. Render backend deployed and 18/18 public HTTP smoke checks passed. Netlify dashboard deployment, public browser acceptance, hosted cold-start and second-device checks remain pending.</w:t>
       </w:r>
+    </w:p>
+    <w:p>
+      <w:r>
+        <w:t xml:space="preserve">Deployed backend health </w:t>
+      </w:r>
+      <w:hyperlink r:id="rId9">
+        <w:r>
+          <w:rPr>
+            <w:rFonts w:ascii="Arial" w:hAnsi="Arial"/>
+            <w:color w:val="006D8C"/>
+            <w:u w:val="single"/>
+          </w:rPr>
+          <w:t>https://bizplus-ai-api.onrender.com/health</w:t>
+        </w:r>
+      </w:hyperlink>
     </w:p>
     <w:p>
       <w:pPr>

</xml_diff>